<commit_message>
More about lookup columns about other from another table using the RELATED function
</commit_message>
<xml_diff>
--- a/Calculated Columns/COUNTROWS AND RELATABLE TABLE/Question/COUNTROWS AND RELATEDTABLE FUNCTION.docx
+++ b/Calculated Columns/COUNTROWS AND RELATABLE TABLE/Question/COUNTROWS AND RELATEDTABLE FUNCTION.docx
@@ -57,70 +57,16 @@
       </w:pPr>
       <w:r>
         <w:rPr>
-          <w:lang w:val="en-US"/>
-        </w:rPr>
-        <w:t>Open the Power bi file in the above folder, and go to the quadrant table:</w:t>
-      </w:r>
-    </w:p>
-    <w:p>
-      <w:pPr>
-        <w:rPr>
-          <w:lang w:val="en-US"/>
-        </w:rPr>
-      </w:pPr>
-    </w:p>
-    <w:p>
-      <w:pPr>
-        <w:rPr>
-          <w:lang w:val="en-US"/>
-        </w:rPr>
-      </w:pPr>
-    </w:p>
-    <w:p>
-      <w:pPr>
-        <w:rPr>
-          <w:lang w:val="en-US"/>
-        </w:rPr>
-      </w:pPr>
-    </w:p>
-    <w:p>
-      <w:pPr>
-        <w:rPr>
-          <w:lang w:val="en-US"/>
-        </w:rPr>
-      </w:pPr>
-    </w:p>
-    <w:p>
-      <w:pPr>
-        <w:rPr>
-          <w:lang w:val="en-US"/>
-        </w:rPr>
-      </w:pPr>
-    </w:p>
-    <w:p>
-      <w:pPr>
-        <w:rPr>
-          <w:lang w:val="en-US"/>
-        </w:rPr>
-      </w:pPr>
-    </w:p>
-    <w:p>
-      <w:pPr>
-        <w:rPr>
-          <w:lang w:val="en-US"/>
-        </w:rPr>
-      </w:pPr>
-      <w:r>
-        <w:rPr>
           <w:b/>
           <w:bCs/>
+          <w:noProof/>
           <w:lang w:val="en-US"/>
         </w:rPr>
         <w:drawing>
-          <wp:anchor distT="0" distB="0" distL="114300" distR="114300" simplePos="0" relativeHeight="251656192" behindDoc="0" locked="0" layoutInCell="1" allowOverlap="1" wp14:anchorId="0E61DABD" wp14:editId="4DFA88B4">
+          <wp:anchor distT="0" distB="0" distL="114300" distR="114300" simplePos="0" relativeHeight="251656704" behindDoc="0" locked="0" layoutInCell="1" allowOverlap="1" wp14:anchorId="0E61DABD" wp14:editId="65E9D472">
             <wp:simplePos x="0" y="0"/>
             <wp:positionH relativeFrom="column">
-              <wp:posOffset>0</wp:posOffset>
+              <wp:posOffset>876300</wp:posOffset>
             </wp:positionH>
             <wp:positionV relativeFrom="page">
               <wp:posOffset>1771650</wp:posOffset>
@@ -168,6 +114,75 @@
       </w:r>
       <w:r>
         <w:rPr>
+          <w:lang w:val="en-US"/>
+        </w:rPr>
+        <w:t xml:space="preserve">Open the Power </w:t>
+      </w:r>
+      <w:proofErr w:type="spellStart"/>
+      <w:r>
+        <w:rPr>
+          <w:lang w:val="en-US"/>
+        </w:rPr>
+        <w:t>bi</w:t>
+      </w:r>
+      <w:proofErr w:type="spellEnd"/>
+      <w:r>
+        <w:rPr>
+          <w:lang w:val="en-US"/>
+        </w:rPr>
+        <w:t xml:space="preserve"> file in the above folder, and go to the quadrant table:</w:t>
+      </w:r>
+    </w:p>
+    <w:p>
+      <w:pPr>
+        <w:rPr>
+          <w:lang w:val="en-US"/>
+        </w:rPr>
+      </w:pPr>
+    </w:p>
+    <w:p>
+      <w:pPr>
+        <w:rPr>
+          <w:lang w:val="en-US"/>
+        </w:rPr>
+      </w:pPr>
+    </w:p>
+    <w:p>
+      <w:pPr>
+        <w:rPr>
+          <w:lang w:val="en-US"/>
+        </w:rPr>
+      </w:pPr>
+    </w:p>
+    <w:p>
+      <w:pPr>
+        <w:rPr>
+          <w:lang w:val="en-US"/>
+        </w:rPr>
+      </w:pPr>
+    </w:p>
+    <w:p>
+      <w:pPr>
+        <w:rPr>
+          <w:lang w:val="en-US"/>
+        </w:rPr>
+      </w:pPr>
+    </w:p>
+    <w:p>
+      <w:pPr>
+        <w:rPr>
+          <w:lang w:val="en-US"/>
+        </w:rPr>
+      </w:pPr>
+    </w:p>
+    <w:p>
+      <w:pPr>
+        <w:rPr>
+          <w:lang w:val="en-US"/>
+        </w:rPr>
+      </w:pPr>
+      <w:r>
+        <w:rPr>
           <w:b/>
           <w:bCs/>
           <w:lang w:val="en-US"/>
@@ -191,10 +206,11 @@
         <w:rPr>
           <w:b/>
           <w:bCs/>
+          <w:noProof/>
           <w:lang w:val="en-US"/>
         </w:rPr>
         <w:drawing>
-          <wp:anchor distT="0" distB="0" distL="114300" distR="114300" simplePos="0" relativeHeight="251660288" behindDoc="0" locked="0" layoutInCell="1" allowOverlap="1" wp14:anchorId="2D64C4AB" wp14:editId="15C36BF3">
+          <wp:anchor distT="0" distB="0" distL="114300" distR="114300" simplePos="0" relativeHeight="251658752" behindDoc="0" locked="0" layoutInCell="1" allowOverlap="1" wp14:anchorId="2D64C4AB" wp14:editId="15C36BF3">
             <wp:simplePos x="0" y="0"/>
             <wp:positionH relativeFrom="column">
               <wp:posOffset>-88900</wp:posOffset>
@@ -300,6 +316,7 @@
       </w:pPr>
       <w:r>
         <w:rPr>
+          <w:noProof/>
           <w:lang w:val="en-US"/>
         </w:rPr>
         <w:drawing>
@@ -438,10 +455,11 @@
       </w:pPr>
       <w:r>
         <w:rPr>
+          <w:noProof/>
           <w:lang w:val="en-US"/>
         </w:rPr>
         <w:drawing>
-          <wp:anchor distT="0" distB="0" distL="114300" distR="114300" simplePos="0" relativeHeight="251660288" behindDoc="0" locked="0" layoutInCell="1" allowOverlap="1" wp14:anchorId="611C83B2" wp14:editId="1AA79060">
+          <wp:anchor distT="0" distB="0" distL="114300" distR="114300" simplePos="0" relativeHeight="251657728" behindDoc="0" locked="0" layoutInCell="1" allowOverlap="1" wp14:anchorId="611C83B2" wp14:editId="1AA79060">
             <wp:simplePos x="0" y="0"/>
             <wp:positionH relativeFrom="column">
               <wp:posOffset>0</wp:posOffset>

</xml_diff>